<commit_message>
added articles and modified backlog
</commit_message>
<xml_diff>
--- a/Trailblazer_Product_Backlog.docx
+++ b/Trailblazer_Product_Backlog.docx
@@ -54,7 +54,25 @@
         <w:t xml:space="preserve"> onto a pressure plate. </w:t>
       </w:r>
       <w:r>
-        <w:t xml:space="preserve">Each robot has a color-coded pressure plate that when activated, sends the robot on its journey. The robots and player can activate any pressure plate and once all are activated, the door to exit the level unlocks. The first robot should be set in motion by the player which then leads to a chain reaction of robots moving to unlock the door. Once a robot is on a pressure plate, the robot is locked in place. The player can also override the arrows by walking over a tile again. </w:t>
+        <w:t xml:space="preserve">Each robot has a color-coded pressure plate that when activated, sends the robot on its journey. </w:t>
+      </w:r>
+      <w:r>
+        <w:t>Only t</w:t>
+      </w:r>
+      <w:r>
+        <w:t xml:space="preserve">he robots can activate </w:t>
+      </w:r>
+      <w:r>
+        <w:t>the</w:t>
+      </w:r>
+      <w:r>
+        <w:t xml:space="preserve"> pressure plate and once all are activated, the door to exit the level unlocks. The first robot should be set in motion by the </w:t>
+      </w:r>
+      <w:r>
+        <w:t>button present in the menu</w:t>
+      </w:r>
+      <w:r>
+        <w:t xml:space="preserve"> which then leads to a chain reaction of robots moving to unlock the door. Once a robot is on a pressure plate, the robot is locked in place. The player can also override the arrows by walking over a tile again. </w:t>
       </w:r>
     </w:p>
     <w:p>
@@ -183,10 +201,7 @@
         <w:pStyle w:val="Heading4"/>
       </w:pPr>
       <w:r>
-        <w:t xml:space="preserve">Name: </w:t>
-      </w:r>
-      <w:r>
-        <w:t>Block collisions</w:t>
+        <w:t>Name: Block collisions</w:t>
       </w:r>
     </w:p>
     <w:p>
@@ -480,6 +495,41 @@
       </w:r>
     </w:p>
     <w:p/>
+    <w:p>
+      <w:r>
+        <w:t>Articles Used for advanced topics:</w:t>
+      </w:r>
+    </w:p>
+    <w:p>
+      <w:r>
+        <w:t xml:space="preserve">Game/Level Design: </w:t>
+      </w:r>
+      <w:hyperlink r:id="rId5" w:history="1">
+        <w:r>
+          <w:rPr>
+            <w:rStyle w:val="Hyperlink"/>
+          </w:rPr>
+          <w:t>https://www.gamedeveloper.com/design/beginning-level-design-part-1</w:t>
+        </w:r>
+      </w:hyperlink>
+    </w:p>
+    <w:p/>
+    <w:p>
+      <w:r>
+        <w:t xml:space="preserve">Git Branching workflows: </w:t>
+      </w:r>
+      <w:hyperlink r:id="rId6" w:history="1">
+        <w:r>
+          <w:rPr>
+            <w:rStyle w:val="Hyperlink"/>
+          </w:rPr>
+          <w:t>https://www.atlassian.com/en/git/tutorials/comparing-workflows</w:t>
+        </w:r>
+      </w:hyperlink>
+      <w:r>
+        <w:br/>
+      </w:r>
+    </w:p>
     <w:sectPr>
       <w:pgSz w:w="12240" w:h="15840"/>
       <w:pgMar w:top="1440" w:right="1440" w:bottom="1440" w:left="1440" w:header="720" w:footer="720" w:gutter="0"/>
@@ -1611,6 +1661,29 @@
       <w:spacing w:val="5"/>
     </w:rPr>
   </w:style>
+  <w:style w:type="character" w:styleId="Hyperlink">
+    <w:name w:val="Hyperlink"/>
+    <w:basedOn w:val="DefaultParagraphFont"/>
+    <w:uiPriority w:val="99"/>
+    <w:unhideWhenUsed/>
+    <w:rsid w:val="00FC6FAE"/>
+    <w:rPr>
+      <w:color w:val="467886" w:themeColor="hyperlink"/>
+      <w:u w:val="single"/>
+    </w:rPr>
+  </w:style>
+  <w:style w:type="character" w:styleId="UnresolvedMention">
+    <w:name w:val="Unresolved Mention"/>
+    <w:basedOn w:val="DefaultParagraphFont"/>
+    <w:uiPriority w:val="99"/>
+    <w:semiHidden/>
+    <w:unhideWhenUsed/>
+    <w:rsid w:val="00FC6FAE"/>
+    <w:rPr>
+      <w:color w:val="605E5C"/>
+      <w:shd w:val="clear" w:color="auto" w:fill="E1DFDD"/>
+    </w:rPr>
+  </w:style>
 </w:styles>
 </file>
 

</xml_diff>

<commit_message>
final touches for the game
</commit_message>
<xml_diff>
--- a/Trailblazer_Product_Backlog.docx
+++ b/Trailblazer_Product_Backlog.docx
@@ -214,6 +214,9 @@
       <w:r>
         <w:t>move outside the grid</w:t>
       </w:r>
+      <w:r>
+        <w:t>. Create block tiles which the player cannot move into.</w:t>
+      </w:r>
     </w:p>
     <w:p>
       <w:pPr>
@@ -228,7 +231,13 @@
         <w:keepNext/>
       </w:pPr>
       <w:r>
-        <w:t xml:space="preserve">Walk into a wall and check whether it advances. </w:t>
+        <w:t>Walk into a wall</w:t>
+      </w:r>
+      <w:r>
+        <w:t xml:space="preserve"> and a block tile</w:t>
+      </w:r>
+      <w:r>
+        <w:t xml:space="preserve"> and check whether it advances. </w:t>
       </w:r>
     </w:p>
     <w:p>
@@ -286,6 +295,7 @@
         <w:pStyle w:val="Heading4"/>
       </w:pPr>
       <w:r>
+        <w:lastRenderedPageBreak/>
         <w:t xml:space="preserve">Name: </w:t>
       </w:r>
       <w:r>

</xml_diff>